<commit_message>
report: exact error text and the original docker run command
</commit_message>
<xml_diff>
--- a/docs/deployment-report/Tatkal_Deployment_Report.docx
+++ b/docs/deployment-report/Tatkal_Deployment_Report.docx
@@ -1717,7 +1717,7 @@
         <w:rPr>
           <w:rStyle w:val="VerbatimChar"/>
         </w:rPr>
-        <w:t xml:space="preserve">docker run -d -p 8012:8002 --env-file services/inventory-service/.env tatkal/inventory-service:1.0</w:t>
+        <w:t xml:space="preserve">docker run -d --name inventory-smoke -p 8002:8002 --env-file services/inventory-service/.env tatkal/inventory-service:1.0</w:t>
       </w:r>
       <w:r>
         <w:t xml:space="preserve">.</w:t>
@@ -4867,7 +4867,7 @@
               <w:rPr>
                 <w:rStyle w:val="VerbatimChar"/>
               </w:rPr>
-              <w:t xml:space="preserve">docker: 'compose' is not a docker command</w:t>
+              <w:t xml:space="preserve">docker: unknown command: docker compose</w:t>
             </w:r>
             <w:r>
               <w:t xml:space="preserve">, although the plugin was installed with Homebrew</w:t>

</xml_diff>

<commit_message>
first minikube deploy was slow because of the postgres download, not our images; note on record
</commit_message>
<xml_diff>
--- a/docs/deployment-report/Tatkal_Deployment_Report.docx
+++ b/docs/deployment-report/Tatkal_Deployment_Report.docx
@@ -2214,7 +2214,22 @@
         <w:t xml:space="preserve"> </w:t>
       </w:r>
       <w:r>
-        <w:t xml:space="preserve">database. To confirm it we changed only the host in the URL (</w:t>
+        <w:t xml:space="preserve">database. To confirm it we changed only the address in the URL (</w:t>
+      </w:r>
+      <w:r>
+        <w:rPr>
+          <w:rStyle w:val="VerbatimChar"/>
+        </w:rPr>
+        <w:t xml:space="preserve">localhost:5442</w:t>
+      </w:r>
+      <w:r>
+        <w:t xml:space="preserve"> </w:t>
+      </w:r>
+      <w:r>
+        <w:t xml:space="preserve">to</w:t>
+      </w:r>
+      <w:r>
+        <w:t xml:space="preserve"> </w:t>
       </w:r>
       <w:r>
         <w:rPr>
@@ -2223,19 +2238,19 @@
         <w:t xml:space="preserve">inventory-db:5432</w:t>
       </w:r>
       <w:r>
-        <w:t xml:space="preserve">) and attached the</w:t>
-      </w:r>
-      <w:r>
-        <w:t xml:space="preserve"> </w:t>
-      </w:r>
-      <w:r>
-        <w:t xml:space="preserve">database’s network: the same image with the same file was healthy within 8 seconds, with no failed</w:t>
-      </w:r>
-      <w:r>
-        <w:t xml:space="preserve"> </w:t>
-      </w:r>
-      <w:r>
-        <w:t xml:space="preserve">attempt.</w:t>
+        <w:t xml:space="preserve">)</w:t>
+      </w:r>
+      <w:r>
+        <w:t xml:space="preserve"> </w:t>
+      </w:r>
+      <w:r>
+        <w:t xml:space="preserve">and attached the database’s network: the same image with the same file was healthy within 8 seconds, with</w:t>
+      </w:r>
+      <w:r>
+        <w:t xml:space="preserve"> </w:t>
+      </w:r>
+      <w:r>
+        <w:t xml:space="preserve">no failed attempt.</w:t>
       </w:r>
     </w:p>
     <w:p>
@@ -2936,7 +2951,7 @@
           <wp:inline>
             <wp:extent cx="6261100" cy="3434021"/>
             <wp:effectExtent b="0" l="0" r="0" t="0"/>
-            <wp:docPr descr="Figure 2 - The Minikube deployment (namespace tatkal). Every service follows the pattern shown for booking-service: a Service, a Deployment and a StatefulSet for its database. The tests reach the cluster through kubectl port-forward on the same local ports as with Compose." title="" id="20" name="Picture"/>
+            <wp:docPr descr="Figure 2 - The Minikube deployment (namespace tatkal). Each service has a Service and a Deployment, and each database a StatefulSet with a headless Service and a volume, as shown for booking-service. The tests reach the cluster through kubectl port-forward on the same local ports as with Compose." title="" id="20" name="Picture"/>
             <a:graphic>
               <a:graphicData uri="http://schemas.openxmlformats.org/drawingml/2006/picture">
                 <pic:pic>
@@ -2979,7 +2994,7 @@
         <w:pStyle w:val="ImageCaption"/>
       </w:pPr>
       <w:r>
-        <w:t xml:space="preserve">Figure 2 - The Minikube deployment (namespace tatkal). Every service follows the pattern shown for booking-service: a Service, a Deployment and a StatefulSet for its database. The tests reach the cluster through kubectl port-forward on the same local ports as with Compose.</w:t>
+        <w:t xml:space="preserve">Figure 2 - The Minikube deployment (namespace tatkal). Each service has a Service and a Deployment, and each database a StatefulSet with a headless Service and a volume, as shown for booking-service. The tests reach the cluster through kubectl port-forward on the same local ports as with Compose.</w:t>
       </w:r>
     </w:p>
     <w:p>
@@ -2987,13 +3002,13 @@
         <w:pStyle w:val="BodyText"/>
       </w:pPr>
       <w:r>
-        <w:t xml:space="preserve">A clean deploy takes 41 s once the images are in Minikube (3 min 36 s the first time, mostly copying the</w:t>
-      </w:r>
-      <w:r>
-        <w:t xml:space="preserve"> </w:t>
-      </w:r>
-      <w:r>
-        <w:t xml:space="preserve">images). The main workflow runs through the Kubernetes Services: with</w:t>
+        <w:t xml:space="preserve">A clean deploy took 41 s. The very first one took 3 min 36 s, almost all of it waiting for the pods while</w:t>
+      </w:r>
+      <w:r>
+        <w:t xml:space="preserve"> </w:t>
+      </w:r>
+      <w:r>
+        <w:t xml:space="preserve">Minikube downloaded the postgres image. The main workflow runs through the Kubernetes Services: with</w:t>
       </w:r>
       <w:r>
         <w:t xml:space="preserve"> </w:t>
@@ -3008,13 +3023,7 @@
         <w:t xml:space="preserve"> </w:t>
       </w:r>
       <w:r>
-        <w:t xml:space="preserve">running, the same</w:t>
-      </w:r>
-      <w:r>
-        <w:t xml:space="preserve"> </w:t>
-      </w:r>
-      <w:r>
-        <w:t xml:space="preserve">7 end-to-end tests pass, reading the logs with</w:t>
+        <w:t xml:space="preserve">running, the same 7 end-to-end tests pass, reading the logs with</w:t>
       </w:r>
       <w:r>
         <w:t xml:space="preserve"> </w:t>
@@ -3026,13 +3035,13 @@
         <w:t xml:space="preserve">kubectl logs</w:t>
       </w:r>
       <w:r>
-        <w:t xml:space="preserve">, and one booking’s correlation id appears in</w:t>
-      </w:r>
-      <w:r>
-        <w:t xml:space="preserve"> </w:t>
-      </w:r>
-      <w:r>
-        <w:t xml:space="preserve">the logs of all five Deployments.</w:t>
+        <w:t xml:space="preserve">, and one</w:t>
+      </w:r>
+      <w:r>
+        <w:t xml:space="preserve"> </w:t>
+      </w:r>
+      <w:r>
+        <w:t xml:space="preserve">booking’s correlation id appears in the logs of all five Deployments.</w:t>
       </w:r>
     </w:p>
     <w:bookmarkEnd w:id="22"/>

</xml_diff>